<commit_message>
new doc file added
</commit_message>
<xml_diff>
--- a/Web_Application_Development_Requirement.docx
+++ b/Web_Application_Development_Requirement.docx
@@ -9,6 +9,13 @@
           <w:bCs/>
         </w:rPr>
       </w:pPr>
+      <w:r>
+        <w:rPr>
+          <w:b/>
+          <w:bCs/>
+        </w:rPr>
+        <w:t>Unicorn</w:t>
+      </w:r>
     </w:p>
     <w:p>
       <w:pPr>
@@ -7824,6 +7831,7 @@
   <w:style w:type="character" w:default="1" w:styleId="DefaultParagraphFont">
     <w:name w:val="Default Paragraph Font"/>
     <w:uiPriority w:val="1"/>
+    <w:semiHidden/>
     <w:unhideWhenUsed/>
   </w:style>
   <w:style w:type="table" w:default="1" w:styleId="TableNormal">

</xml_diff>